<commit_message>
Sửa định dạng danh sách: tiêu đề ngắt dòng cân đối, căn giữa các cột và hàng, chiều cao hàng đều, nới cột họ tên và ghi chú; bộ kiểm tra bắt chữ mồ côi ở tiêu đề
Co-Authored-By: Claude Sonnet 5.5 <noreply@anthropic.com>
Claude-Session: https://claude.ai/code/session_01T37v9MbVMU9yXHRJ84QwZj
</commit_message>
<xml_diff>
--- a/tests/outputs/soan-ke-hoach-ct--tai-lon.docx
+++ b/tests/outputs/soan-ke-hoach-ct--tai-lon.docx
@@ -236,6 +236,7 @@
       </w:tblGrid>
       <w:tr>
         <w:trPr>
+          <w:trHeight w:val="454" w:hRule="atLeast"/>
           <w:cantSplit/>
           <w:tblHeader/>
         </w:trPr>
@@ -352,6 +353,7 @@
       </w:tr>
       <w:tr>
         <w:trPr>
+          <w:trHeight w:val="454" w:hRule="atLeast"/>
           <w:cantSplit/>
         </w:trPr>
         <w:tc>
@@ -404,7 +406,7 @@
           <w:p>
             <w:pPr>
               <w:spacing w:after="40" w:before="40"/>
-              <w:jc w:val="left"/>
+              <w:jc w:val="center"/>
             </w:pPr>
             <w:r/>
             <w:r>
@@ -425,7 +427,7 @@
           <w:p>
             <w:pPr>
               <w:spacing w:after="40" w:before="40"/>
-              <w:jc w:val="left"/>
+              <w:jc w:val="center"/>
             </w:pPr>
             <w:r/>
             <w:r>
@@ -462,6 +464,7 @@
       </w:tr>
       <w:tr>
         <w:trPr>
+          <w:trHeight w:val="454" w:hRule="atLeast"/>
           <w:cantSplit/>
         </w:trPr>
         <w:tc>
@@ -514,7 +517,7 @@
           <w:p>
             <w:pPr>
               <w:spacing w:after="40" w:before="40"/>
-              <w:jc w:val="left"/>
+              <w:jc w:val="center"/>
             </w:pPr>
             <w:r/>
             <w:r>
@@ -535,7 +538,7 @@
           <w:p>
             <w:pPr>
               <w:spacing w:after="40" w:before="40"/>
-              <w:jc w:val="left"/>
+              <w:jc w:val="center"/>
             </w:pPr>
             <w:r/>
             <w:r>
@@ -572,6 +575,7 @@
       </w:tr>
       <w:tr>
         <w:trPr>
+          <w:trHeight w:val="454" w:hRule="atLeast"/>
           <w:cantSplit/>
         </w:trPr>
         <w:tc>
@@ -624,7 +628,7 @@
           <w:p>
             <w:pPr>
               <w:spacing w:after="40" w:before="40"/>
-              <w:jc w:val="left"/>
+              <w:jc w:val="center"/>
             </w:pPr>
             <w:r/>
             <w:r>
@@ -645,7 +649,7 @@
           <w:p>
             <w:pPr>
               <w:spacing w:after="40" w:before="40"/>
-              <w:jc w:val="left"/>
+              <w:jc w:val="center"/>
             </w:pPr>
             <w:r/>
             <w:r>
@@ -682,6 +686,7 @@
       </w:tr>
       <w:tr>
         <w:trPr>
+          <w:trHeight w:val="454" w:hRule="atLeast"/>
           <w:cantSplit/>
         </w:trPr>
         <w:tc>
@@ -734,7 +739,7 @@
           <w:p>
             <w:pPr>
               <w:spacing w:after="40" w:before="40"/>
-              <w:jc w:val="left"/>
+              <w:jc w:val="center"/>
             </w:pPr>
             <w:r/>
             <w:r>
@@ -755,7 +760,7 @@
           <w:p>
             <w:pPr>
               <w:spacing w:after="40" w:before="40"/>
-              <w:jc w:val="left"/>
+              <w:jc w:val="center"/>
             </w:pPr>
             <w:r/>
             <w:r>
@@ -792,6 +797,7 @@
       </w:tr>
       <w:tr>
         <w:trPr>
+          <w:trHeight w:val="454" w:hRule="atLeast"/>
           <w:cantSplit/>
         </w:trPr>
         <w:tc>
@@ -844,7 +850,7 @@
           <w:p>
             <w:pPr>
               <w:spacing w:after="40" w:before="40"/>
-              <w:jc w:val="left"/>
+              <w:jc w:val="center"/>
             </w:pPr>
             <w:r/>
             <w:r>
@@ -865,7 +871,7 @@
           <w:p>
             <w:pPr>
               <w:spacing w:after="40" w:before="40"/>
-              <w:jc w:val="left"/>
+              <w:jc w:val="center"/>
             </w:pPr>
             <w:r/>
             <w:r>
@@ -902,6 +908,7 @@
       </w:tr>
       <w:tr>
         <w:trPr>
+          <w:trHeight w:val="454" w:hRule="atLeast"/>
           <w:cantSplit/>
         </w:trPr>
         <w:tc>
@@ -954,7 +961,7 @@
           <w:p>
             <w:pPr>
               <w:spacing w:after="40" w:before="40"/>
-              <w:jc w:val="left"/>
+              <w:jc w:val="center"/>
             </w:pPr>
             <w:r/>
             <w:r>
@@ -975,7 +982,7 @@
           <w:p>
             <w:pPr>
               <w:spacing w:after="40" w:before="40"/>
-              <w:jc w:val="left"/>
+              <w:jc w:val="center"/>
             </w:pPr>
             <w:r/>
             <w:r>
@@ -1012,6 +1019,7 @@
       </w:tr>
       <w:tr>
         <w:trPr>
+          <w:trHeight w:val="454" w:hRule="atLeast"/>
           <w:cantSplit/>
         </w:trPr>
         <w:tc>
@@ -1064,7 +1072,7 @@
           <w:p>
             <w:pPr>
               <w:spacing w:after="40" w:before="40"/>
-              <w:jc w:val="left"/>
+              <w:jc w:val="center"/>
             </w:pPr>
             <w:r/>
             <w:r>
@@ -1085,7 +1093,7 @@
           <w:p>
             <w:pPr>
               <w:spacing w:after="40" w:before="40"/>
-              <w:jc w:val="left"/>
+              <w:jc w:val="center"/>
             </w:pPr>
             <w:r/>
             <w:r>
@@ -1122,6 +1130,7 @@
       </w:tr>
       <w:tr>
         <w:trPr>
+          <w:trHeight w:val="454" w:hRule="atLeast"/>
           <w:cantSplit/>
         </w:trPr>
         <w:tc>
@@ -1174,7 +1183,7 @@
           <w:p>
             <w:pPr>
               <w:spacing w:after="40" w:before="40"/>
-              <w:jc w:val="left"/>
+              <w:jc w:val="center"/>
             </w:pPr>
             <w:r/>
             <w:r>
@@ -1195,7 +1204,7 @@
           <w:p>
             <w:pPr>
               <w:spacing w:after="40" w:before="40"/>
-              <w:jc w:val="left"/>
+              <w:jc w:val="center"/>
             </w:pPr>
             <w:r/>
             <w:r>
@@ -1232,6 +1241,7 @@
       </w:tr>
       <w:tr>
         <w:trPr>
+          <w:trHeight w:val="454" w:hRule="atLeast"/>
           <w:cantSplit/>
         </w:trPr>
         <w:tc>
@@ -1284,7 +1294,7 @@
           <w:p>
             <w:pPr>
               <w:spacing w:after="40" w:before="40"/>
-              <w:jc w:val="left"/>
+              <w:jc w:val="center"/>
             </w:pPr>
             <w:r/>
             <w:r>
@@ -1305,7 +1315,7 @@
           <w:p>
             <w:pPr>
               <w:spacing w:after="40" w:before="40"/>
-              <w:jc w:val="left"/>
+              <w:jc w:val="center"/>
             </w:pPr>
             <w:r/>
             <w:r>
@@ -1342,6 +1352,7 @@
       </w:tr>
       <w:tr>
         <w:trPr>
+          <w:trHeight w:val="454" w:hRule="atLeast"/>
           <w:cantSplit/>
         </w:trPr>
         <w:tc>
@@ -1394,7 +1405,7 @@
           <w:p>
             <w:pPr>
               <w:spacing w:after="40" w:before="40"/>
-              <w:jc w:val="left"/>
+              <w:jc w:val="center"/>
             </w:pPr>
             <w:r/>
             <w:r>
@@ -1415,7 +1426,7 @@
           <w:p>
             <w:pPr>
               <w:spacing w:after="40" w:before="40"/>
-              <w:jc w:val="left"/>
+              <w:jc w:val="center"/>
             </w:pPr>
             <w:r/>
             <w:r>
@@ -1452,6 +1463,7 @@
       </w:tr>
       <w:tr>
         <w:trPr>
+          <w:trHeight w:val="454" w:hRule="atLeast"/>
           <w:cantSplit/>
         </w:trPr>
         <w:tc>
@@ -1504,7 +1516,7 @@
           <w:p>
             <w:pPr>
               <w:spacing w:after="40" w:before="40"/>
-              <w:jc w:val="left"/>
+              <w:jc w:val="center"/>
             </w:pPr>
             <w:r/>
             <w:r>
@@ -1525,7 +1537,7 @@
           <w:p>
             <w:pPr>
               <w:spacing w:after="40" w:before="40"/>
-              <w:jc w:val="left"/>
+              <w:jc w:val="center"/>
             </w:pPr>
             <w:r/>
             <w:r>
@@ -1562,6 +1574,7 @@
       </w:tr>
       <w:tr>
         <w:trPr>
+          <w:trHeight w:val="454" w:hRule="atLeast"/>
           <w:cantSplit/>
         </w:trPr>
         <w:tc>
@@ -1614,7 +1627,7 @@
           <w:p>
             <w:pPr>
               <w:spacing w:after="40" w:before="40"/>
-              <w:jc w:val="left"/>
+              <w:jc w:val="center"/>
             </w:pPr>
             <w:r/>
             <w:r>
@@ -1635,7 +1648,7 @@
           <w:p>
             <w:pPr>
               <w:spacing w:after="40" w:before="40"/>
-              <w:jc w:val="left"/>
+              <w:jc w:val="center"/>
             </w:pPr>
             <w:r/>
             <w:r>
@@ -1672,6 +1685,7 @@
       </w:tr>
       <w:tr>
         <w:trPr>
+          <w:trHeight w:val="454" w:hRule="atLeast"/>
           <w:cantSplit/>
         </w:trPr>
         <w:tc>
@@ -1724,7 +1738,7 @@
           <w:p>
             <w:pPr>
               <w:spacing w:after="40" w:before="40"/>
-              <w:jc w:val="left"/>
+              <w:jc w:val="center"/>
             </w:pPr>
             <w:r/>
             <w:r>
@@ -1744,7 +1758,7 @@
           <w:p>
             <w:pPr>
               <w:spacing w:after="40" w:before="40"/>
-              <w:jc w:val="left"/>
+              <w:jc w:val="center"/>
             </w:pPr>
             <w:r/>
             <w:r>
@@ -1781,6 +1795,7 @@
       </w:tr>
       <w:tr>
         <w:trPr>
+          <w:trHeight w:val="454" w:hRule="atLeast"/>
           <w:cantSplit/>
         </w:trPr>
         <w:tc>
@@ -1833,7 +1848,7 @@
           <w:p>
             <w:pPr>
               <w:spacing w:after="40" w:before="40"/>
-              <w:jc w:val="left"/>
+              <w:jc w:val="center"/>
             </w:pPr>
             <w:r/>
             <w:r>
@@ -1854,7 +1869,7 @@
           <w:p>
             <w:pPr>
               <w:spacing w:after="40" w:before="40"/>
-              <w:jc w:val="left"/>
+              <w:jc w:val="center"/>
             </w:pPr>
             <w:r/>
             <w:r>
@@ -1891,6 +1906,7 @@
       </w:tr>
       <w:tr>
         <w:trPr>
+          <w:trHeight w:val="454" w:hRule="atLeast"/>
           <w:cantSplit/>
         </w:trPr>
         <w:tc>
@@ -1943,7 +1959,7 @@
           <w:p>
             <w:pPr>
               <w:spacing w:after="40" w:before="40"/>
-              <w:jc w:val="left"/>
+              <w:jc w:val="center"/>
             </w:pPr>
             <w:r/>
             <w:r>
@@ -1964,7 +1980,7 @@
           <w:p>
             <w:pPr>
               <w:spacing w:after="40" w:before="40"/>
-              <w:jc w:val="left"/>
+              <w:jc w:val="center"/>
             </w:pPr>
             <w:r/>
             <w:r>
@@ -2001,6 +2017,7 @@
       </w:tr>
       <w:tr>
         <w:trPr>
+          <w:trHeight w:val="454" w:hRule="atLeast"/>
           <w:cantSplit/>
         </w:trPr>
         <w:tc>
@@ -2053,7 +2070,7 @@
           <w:p>
             <w:pPr>
               <w:spacing w:after="40" w:before="40"/>
-              <w:jc w:val="left"/>
+              <w:jc w:val="center"/>
             </w:pPr>
             <w:r/>
             <w:r>
@@ -2074,7 +2091,7 @@
           <w:p>
             <w:pPr>
               <w:spacing w:after="40" w:before="40"/>
-              <w:jc w:val="left"/>
+              <w:jc w:val="center"/>
             </w:pPr>
             <w:r/>
             <w:r>
@@ -2111,6 +2128,7 @@
       </w:tr>
       <w:tr>
         <w:trPr>
+          <w:trHeight w:val="454" w:hRule="atLeast"/>
           <w:cantSplit/>
         </w:trPr>
         <w:tc>
@@ -2163,7 +2181,7 @@
           <w:p>
             <w:pPr>
               <w:spacing w:after="40" w:before="40"/>
-              <w:jc w:val="left"/>
+              <w:jc w:val="center"/>
             </w:pPr>
             <w:r/>
             <w:r>
@@ -2184,7 +2202,7 @@
           <w:p>
             <w:pPr>
               <w:spacing w:after="40" w:before="40"/>
-              <w:jc w:val="left"/>
+              <w:jc w:val="center"/>
             </w:pPr>
             <w:r/>
             <w:r>
@@ -2221,6 +2239,7 @@
       </w:tr>
       <w:tr>
         <w:trPr>
+          <w:trHeight w:val="454" w:hRule="atLeast"/>
           <w:cantSplit/>
         </w:trPr>
         <w:tc>
@@ -2273,7 +2292,7 @@
           <w:p>
             <w:pPr>
               <w:spacing w:after="40" w:before="40"/>
-              <w:jc w:val="left"/>
+              <w:jc w:val="center"/>
             </w:pPr>
             <w:r/>
             <w:r>
@@ -2294,7 +2313,7 @@
           <w:p>
             <w:pPr>
               <w:spacing w:after="40" w:before="40"/>
-              <w:jc w:val="left"/>
+              <w:jc w:val="center"/>
             </w:pPr>
             <w:r/>
             <w:r>
@@ -2331,6 +2350,7 @@
       </w:tr>
       <w:tr>
         <w:trPr>
+          <w:trHeight w:val="454" w:hRule="atLeast"/>
           <w:cantSplit/>
         </w:trPr>
         <w:tc>
@@ -2383,7 +2403,7 @@
           <w:p>
             <w:pPr>
               <w:spacing w:after="40" w:before="40"/>
-              <w:jc w:val="left"/>
+              <w:jc w:val="center"/>
             </w:pPr>
             <w:r/>
             <w:r>
@@ -2404,7 +2424,7 @@
           <w:p>
             <w:pPr>
               <w:spacing w:after="40" w:before="40"/>
-              <w:jc w:val="left"/>
+              <w:jc w:val="center"/>
             </w:pPr>
             <w:r/>
             <w:r>
@@ -2441,6 +2461,7 @@
       </w:tr>
       <w:tr>
         <w:trPr>
+          <w:trHeight w:val="454" w:hRule="atLeast"/>
           <w:cantSplit/>
         </w:trPr>
         <w:tc>
@@ -2493,7 +2514,7 @@
           <w:p>
             <w:pPr>
               <w:spacing w:after="40" w:before="40"/>
-              <w:jc w:val="left"/>
+              <w:jc w:val="center"/>
             </w:pPr>
             <w:r/>
             <w:r>
@@ -2514,7 +2535,7 @@
           <w:p>
             <w:pPr>
               <w:spacing w:after="40" w:before="40"/>
-              <w:jc w:val="left"/>
+              <w:jc w:val="center"/>
             </w:pPr>
             <w:r/>
             <w:r>
@@ -2551,6 +2572,7 @@
       </w:tr>
       <w:tr>
         <w:trPr>
+          <w:trHeight w:val="454" w:hRule="atLeast"/>
           <w:cantSplit/>
         </w:trPr>
         <w:tc>
@@ -2603,7 +2625,7 @@
           <w:p>
             <w:pPr>
               <w:spacing w:after="40" w:before="40"/>
-              <w:jc w:val="left"/>
+              <w:jc w:val="center"/>
             </w:pPr>
             <w:r/>
             <w:r>
@@ -2624,7 +2646,7 @@
           <w:p>
             <w:pPr>
               <w:spacing w:after="40" w:before="40"/>
-              <w:jc w:val="left"/>
+              <w:jc w:val="center"/>
             </w:pPr>
             <w:r/>
             <w:r>
@@ -2661,6 +2683,7 @@
       </w:tr>
       <w:tr>
         <w:trPr>
+          <w:trHeight w:val="454" w:hRule="atLeast"/>
           <w:cantSplit/>
         </w:trPr>
         <w:tc>
@@ -2713,7 +2736,7 @@
           <w:p>
             <w:pPr>
               <w:spacing w:after="40" w:before="40"/>
-              <w:jc w:val="left"/>
+              <w:jc w:val="center"/>
             </w:pPr>
             <w:r/>
             <w:r>
@@ -2734,7 +2757,7 @@
           <w:p>
             <w:pPr>
               <w:spacing w:after="40" w:before="40"/>
-              <w:jc w:val="left"/>
+              <w:jc w:val="center"/>
             </w:pPr>
             <w:r/>
             <w:r>
@@ -2771,6 +2794,7 @@
       </w:tr>
       <w:tr>
         <w:trPr>
+          <w:trHeight w:val="454" w:hRule="atLeast"/>
           <w:cantSplit/>
         </w:trPr>
         <w:tc>
@@ -2823,7 +2847,7 @@
           <w:p>
             <w:pPr>
               <w:spacing w:after="40" w:before="40"/>
-              <w:jc w:val="left"/>
+              <w:jc w:val="center"/>
             </w:pPr>
             <w:r/>
             <w:r>
@@ -2844,7 +2868,7 @@
           <w:p>
             <w:pPr>
               <w:spacing w:after="40" w:before="40"/>
-              <w:jc w:val="left"/>
+              <w:jc w:val="center"/>
             </w:pPr>
             <w:r/>
             <w:r>
@@ -2881,6 +2905,7 @@
       </w:tr>
       <w:tr>
         <w:trPr>
+          <w:trHeight w:val="454" w:hRule="atLeast"/>
           <w:cantSplit/>
         </w:trPr>
         <w:tc>
@@ -2933,7 +2958,7 @@
           <w:p>
             <w:pPr>
               <w:spacing w:after="40" w:before="40"/>
-              <w:jc w:val="left"/>
+              <w:jc w:val="center"/>
             </w:pPr>
             <w:r/>
             <w:r>
@@ -2954,7 +2979,7 @@
           <w:p>
             <w:pPr>
               <w:spacing w:after="40" w:before="40"/>
-              <w:jc w:val="left"/>
+              <w:jc w:val="center"/>
             </w:pPr>
             <w:r/>
             <w:r>
@@ -2991,6 +3016,7 @@
       </w:tr>
       <w:tr>
         <w:trPr>
+          <w:trHeight w:val="454" w:hRule="atLeast"/>
           <w:cantSplit/>
         </w:trPr>
         <w:tc>
@@ -3043,7 +3069,7 @@
           <w:p>
             <w:pPr>
               <w:spacing w:after="40" w:before="40"/>
-              <w:jc w:val="left"/>
+              <w:jc w:val="center"/>
             </w:pPr>
             <w:r/>
             <w:r>
@@ -3064,7 +3090,7 @@
           <w:p>
             <w:pPr>
               <w:spacing w:after="40" w:before="40"/>
-              <w:jc w:val="left"/>
+              <w:jc w:val="center"/>
             </w:pPr>
             <w:r/>
             <w:r>
@@ -3101,6 +3127,7 @@
       </w:tr>
       <w:tr>
         <w:trPr>
+          <w:trHeight w:val="454" w:hRule="atLeast"/>
           <w:cantSplit/>
         </w:trPr>
         <w:tc>
@@ -3153,7 +3180,7 @@
           <w:p>
             <w:pPr>
               <w:spacing w:after="40" w:before="40"/>
-              <w:jc w:val="left"/>
+              <w:jc w:val="center"/>
             </w:pPr>
             <w:r/>
             <w:r>
@@ -3174,7 +3201,7 @@
           <w:p>
             <w:pPr>
               <w:spacing w:after="40" w:before="40"/>
-              <w:jc w:val="left"/>
+              <w:jc w:val="center"/>
             </w:pPr>
             <w:r/>
             <w:r>
@@ -3211,6 +3238,7 @@
       </w:tr>
       <w:tr>
         <w:trPr>
+          <w:trHeight w:val="454" w:hRule="atLeast"/>
           <w:cantSplit/>
         </w:trPr>
         <w:tc>
@@ -3263,7 +3291,7 @@
           <w:p>
             <w:pPr>
               <w:spacing w:after="40" w:before="40"/>
-              <w:jc w:val="left"/>
+              <w:jc w:val="center"/>
             </w:pPr>
             <w:r/>
             <w:r>
@@ -3284,7 +3312,7 @@
           <w:p>
             <w:pPr>
               <w:spacing w:after="40" w:before="40"/>
-              <w:jc w:val="left"/>
+              <w:jc w:val="center"/>
             </w:pPr>
             <w:r/>
             <w:r>
@@ -3321,6 +3349,7 @@
       </w:tr>
       <w:tr>
         <w:trPr>
+          <w:trHeight w:val="454" w:hRule="atLeast"/>
           <w:cantSplit/>
         </w:trPr>
         <w:tc>
@@ -3373,7 +3402,7 @@
           <w:p>
             <w:pPr>
               <w:spacing w:after="40" w:before="40"/>
-              <w:jc w:val="left"/>
+              <w:jc w:val="center"/>
             </w:pPr>
             <w:r/>
             <w:r>
@@ -3394,7 +3423,7 @@
           <w:p>
             <w:pPr>
               <w:spacing w:after="40" w:before="40"/>
-              <w:jc w:val="left"/>
+              <w:jc w:val="center"/>
             </w:pPr>
             <w:r/>
             <w:r>
@@ -3431,6 +3460,7 @@
       </w:tr>
       <w:tr>
         <w:trPr>
+          <w:trHeight w:val="454" w:hRule="atLeast"/>
           <w:cantSplit/>
         </w:trPr>
         <w:tc>
@@ -3483,7 +3513,7 @@
           <w:p>
             <w:pPr>
               <w:spacing w:after="40" w:before="40"/>
-              <w:jc w:val="left"/>
+              <w:jc w:val="center"/>
             </w:pPr>
             <w:r/>
             <w:r>
@@ -3504,7 +3534,7 @@
           <w:p>
             <w:pPr>
               <w:spacing w:after="40" w:before="40"/>
-              <w:jc w:val="left"/>
+              <w:jc w:val="center"/>
             </w:pPr>
             <w:r/>
             <w:r>
@@ -3541,6 +3571,7 @@
       </w:tr>
       <w:tr>
         <w:trPr>
+          <w:trHeight w:val="454" w:hRule="atLeast"/>
           <w:cantSplit/>
         </w:trPr>
         <w:tc>
@@ -3593,7 +3624,7 @@
           <w:p>
             <w:pPr>
               <w:spacing w:after="40" w:before="40"/>
-              <w:jc w:val="left"/>
+              <w:jc w:val="center"/>
             </w:pPr>
             <w:r/>
             <w:r>
@@ -3614,7 +3645,7 @@
           <w:p>
             <w:pPr>
               <w:spacing w:after="40" w:before="40"/>
-              <w:jc w:val="left"/>
+              <w:jc w:val="center"/>
             </w:pPr>
             <w:r/>
             <w:r>
@@ -3651,6 +3682,7 @@
       </w:tr>
       <w:tr>
         <w:trPr>
+          <w:trHeight w:val="454" w:hRule="atLeast"/>
           <w:cantSplit/>
         </w:trPr>
         <w:tc>
@@ -3703,7 +3735,7 @@
           <w:p>
             <w:pPr>
               <w:spacing w:after="40" w:before="40"/>
-              <w:jc w:val="left"/>
+              <w:jc w:val="center"/>
             </w:pPr>
             <w:r/>
             <w:r>
@@ -3724,7 +3756,7 @@
           <w:p>
             <w:pPr>
               <w:spacing w:after="40" w:before="40"/>
-              <w:jc w:val="left"/>
+              <w:jc w:val="center"/>
             </w:pPr>
             <w:r/>
             <w:r>
@@ -3761,6 +3793,7 @@
       </w:tr>
       <w:tr>
         <w:trPr>
+          <w:trHeight w:val="454" w:hRule="atLeast"/>
           <w:cantSplit/>
         </w:trPr>
         <w:tc>
@@ -3813,7 +3846,7 @@
           <w:p>
             <w:pPr>
               <w:spacing w:after="40" w:before="40"/>
-              <w:jc w:val="left"/>
+              <w:jc w:val="center"/>
             </w:pPr>
             <w:r/>
             <w:r>
@@ -3833,7 +3866,7 @@
           <w:p>
             <w:pPr>
               <w:spacing w:after="40" w:before="40"/>
-              <w:jc w:val="left"/>
+              <w:jc w:val="center"/>
             </w:pPr>
             <w:r/>
             <w:r>
@@ -3870,6 +3903,7 @@
       </w:tr>
       <w:tr>
         <w:trPr>
+          <w:trHeight w:val="454" w:hRule="atLeast"/>
           <w:cantSplit/>
         </w:trPr>
         <w:tc>
@@ -3922,7 +3956,7 @@
           <w:p>
             <w:pPr>
               <w:spacing w:after="40" w:before="40"/>
-              <w:jc w:val="left"/>
+              <w:jc w:val="center"/>
             </w:pPr>
             <w:r/>
             <w:r>
@@ -3943,7 +3977,7 @@
           <w:p>
             <w:pPr>
               <w:spacing w:after="40" w:before="40"/>
-              <w:jc w:val="left"/>
+              <w:jc w:val="center"/>
             </w:pPr>
             <w:r/>
             <w:r>
@@ -3980,6 +4014,7 @@
       </w:tr>
       <w:tr>
         <w:trPr>
+          <w:trHeight w:val="454" w:hRule="atLeast"/>
           <w:cantSplit/>
         </w:trPr>
         <w:tc>
@@ -4032,7 +4067,7 @@
           <w:p>
             <w:pPr>
               <w:spacing w:after="40" w:before="40"/>
-              <w:jc w:val="left"/>
+              <w:jc w:val="center"/>
             </w:pPr>
             <w:r/>
             <w:r>
@@ -4053,7 +4088,7 @@
           <w:p>
             <w:pPr>
               <w:spacing w:after="40" w:before="40"/>
-              <w:jc w:val="left"/>
+              <w:jc w:val="center"/>
             </w:pPr>
             <w:r/>
             <w:r>
@@ -4090,6 +4125,7 @@
       </w:tr>
       <w:tr>
         <w:trPr>
+          <w:trHeight w:val="454" w:hRule="atLeast"/>
           <w:cantSplit/>
         </w:trPr>
         <w:tc>
@@ -4142,7 +4178,7 @@
           <w:p>
             <w:pPr>
               <w:spacing w:after="40" w:before="40"/>
-              <w:jc w:val="left"/>
+              <w:jc w:val="center"/>
             </w:pPr>
             <w:r/>
             <w:r>
@@ -4163,7 +4199,7 @@
           <w:p>
             <w:pPr>
               <w:spacing w:after="40" w:before="40"/>
-              <w:jc w:val="left"/>
+              <w:jc w:val="center"/>
             </w:pPr>
             <w:r/>
             <w:r>
@@ -4200,6 +4236,7 @@
       </w:tr>
       <w:tr>
         <w:trPr>
+          <w:trHeight w:val="454" w:hRule="atLeast"/>
           <w:cantSplit/>
         </w:trPr>
         <w:tc>
@@ -4252,7 +4289,7 @@
           <w:p>
             <w:pPr>
               <w:spacing w:after="40" w:before="40"/>
-              <w:jc w:val="left"/>
+              <w:jc w:val="center"/>
             </w:pPr>
             <w:r/>
             <w:r>
@@ -4273,7 +4310,7 @@
           <w:p>
             <w:pPr>
               <w:spacing w:after="40" w:before="40"/>
-              <w:jc w:val="left"/>
+              <w:jc w:val="center"/>
             </w:pPr>
             <w:r/>
             <w:r>
@@ -4310,6 +4347,7 @@
       </w:tr>
       <w:tr>
         <w:trPr>
+          <w:trHeight w:val="454" w:hRule="atLeast"/>
           <w:cantSplit/>
         </w:trPr>
         <w:tc>
@@ -4362,7 +4400,7 @@
           <w:p>
             <w:pPr>
               <w:spacing w:after="40" w:before="40"/>
-              <w:jc w:val="left"/>
+              <w:jc w:val="center"/>
             </w:pPr>
             <w:r/>
             <w:r>
@@ -4383,7 +4421,7 @@
           <w:p>
             <w:pPr>
               <w:spacing w:after="40" w:before="40"/>
-              <w:jc w:val="left"/>
+              <w:jc w:val="center"/>
             </w:pPr>
             <w:r/>
             <w:r>
@@ -4420,6 +4458,7 @@
       </w:tr>
       <w:tr>
         <w:trPr>
+          <w:trHeight w:val="454" w:hRule="atLeast"/>
           <w:cantSplit/>
         </w:trPr>
         <w:tc>
@@ -4472,7 +4511,7 @@
           <w:p>
             <w:pPr>
               <w:spacing w:after="40" w:before="40"/>
-              <w:jc w:val="left"/>
+              <w:jc w:val="center"/>
             </w:pPr>
             <w:r/>
             <w:r>
@@ -4493,7 +4532,7 @@
           <w:p>
             <w:pPr>
               <w:spacing w:after="40" w:before="40"/>
-              <w:jc w:val="left"/>
+              <w:jc w:val="center"/>
             </w:pPr>
             <w:r/>
             <w:r>
@@ -4530,6 +4569,7 @@
       </w:tr>
       <w:tr>
         <w:trPr>
+          <w:trHeight w:val="454" w:hRule="atLeast"/>
           <w:cantSplit/>
         </w:trPr>
         <w:tc>
@@ -4582,7 +4622,7 @@
           <w:p>
             <w:pPr>
               <w:spacing w:after="40" w:before="40"/>
-              <w:jc w:val="left"/>
+              <w:jc w:val="center"/>
             </w:pPr>
             <w:r/>
             <w:r>
@@ -4603,7 +4643,7 @@
           <w:p>
             <w:pPr>
               <w:spacing w:after="40" w:before="40"/>
-              <w:jc w:val="left"/>
+              <w:jc w:val="center"/>
             </w:pPr>
             <w:r/>
             <w:r>
@@ -4640,6 +4680,7 @@
       </w:tr>
       <w:tr>
         <w:trPr>
+          <w:trHeight w:val="454" w:hRule="atLeast"/>
           <w:cantSplit/>
         </w:trPr>
         <w:tc>
@@ -4692,7 +4733,7 @@
           <w:p>
             <w:pPr>
               <w:spacing w:after="40" w:before="40"/>
-              <w:jc w:val="left"/>
+              <w:jc w:val="center"/>
             </w:pPr>
             <w:r/>
             <w:r>
@@ -4713,7 +4754,7 @@
           <w:p>
             <w:pPr>
               <w:spacing w:after="40" w:before="40"/>
-              <w:jc w:val="left"/>
+              <w:jc w:val="center"/>
             </w:pPr>
             <w:r/>
             <w:r>
@@ -4750,6 +4791,7 @@
       </w:tr>
       <w:tr>
         <w:trPr>
+          <w:trHeight w:val="454" w:hRule="atLeast"/>
           <w:cantSplit/>
         </w:trPr>
         <w:tc>
@@ -4802,7 +4844,7 @@
           <w:p>
             <w:pPr>
               <w:spacing w:after="40" w:before="40"/>
-              <w:jc w:val="left"/>
+              <w:jc w:val="center"/>
             </w:pPr>
             <w:r/>
             <w:r>
@@ -4823,7 +4865,7 @@
           <w:p>
             <w:pPr>
               <w:spacing w:after="40" w:before="40"/>
-              <w:jc w:val="left"/>
+              <w:jc w:val="center"/>
             </w:pPr>
             <w:r/>
             <w:r>
@@ -4860,6 +4902,7 @@
       </w:tr>
       <w:tr>
         <w:trPr>
+          <w:trHeight w:val="454" w:hRule="atLeast"/>
           <w:cantSplit/>
         </w:trPr>
         <w:tc>
@@ -4912,7 +4955,7 @@
           <w:p>
             <w:pPr>
               <w:spacing w:after="40" w:before="40"/>
-              <w:jc w:val="left"/>
+              <w:jc w:val="center"/>
             </w:pPr>
             <w:r/>
             <w:r>
@@ -4933,7 +4976,7 @@
           <w:p>
             <w:pPr>
               <w:spacing w:after="40" w:before="40"/>
-              <w:jc w:val="left"/>
+              <w:jc w:val="center"/>
             </w:pPr>
             <w:r/>
             <w:r>
@@ -4970,6 +5013,7 @@
       </w:tr>
       <w:tr>
         <w:trPr>
+          <w:trHeight w:val="454" w:hRule="atLeast"/>
           <w:cantSplit/>
         </w:trPr>
         <w:tc>
@@ -5022,7 +5066,7 @@
           <w:p>
             <w:pPr>
               <w:spacing w:after="40" w:before="40"/>
-              <w:jc w:val="left"/>
+              <w:jc w:val="center"/>
             </w:pPr>
             <w:r/>
             <w:r>
@@ -5043,7 +5087,7 @@
           <w:p>
             <w:pPr>
               <w:spacing w:after="40" w:before="40"/>
-              <w:jc w:val="left"/>
+              <w:jc w:val="center"/>
             </w:pPr>
             <w:r/>
             <w:r>
@@ -5080,6 +5124,7 @@
       </w:tr>
       <w:tr>
         <w:trPr>
+          <w:trHeight w:val="454" w:hRule="atLeast"/>
           <w:cantSplit/>
         </w:trPr>
         <w:tc>
@@ -5132,7 +5177,7 @@
           <w:p>
             <w:pPr>
               <w:spacing w:after="40" w:before="40"/>
-              <w:jc w:val="left"/>
+              <w:jc w:val="center"/>
             </w:pPr>
             <w:r/>
             <w:r>
@@ -5153,7 +5198,7 @@
           <w:p>
             <w:pPr>
               <w:spacing w:after="40" w:before="40"/>
-              <w:jc w:val="left"/>
+              <w:jc w:val="center"/>
             </w:pPr>
             <w:r/>
             <w:r>
@@ -5190,6 +5235,7 @@
       </w:tr>
       <w:tr>
         <w:trPr>
+          <w:trHeight w:val="454" w:hRule="atLeast"/>
           <w:cantSplit/>
         </w:trPr>
         <w:tc>
@@ -5242,7 +5288,7 @@
           <w:p>
             <w:pPr>
               <w:spacing w:after="40" w:before="40"/>
-              <w:jc w:val="left"/>
+              <w:jc w:val="center"/>
             </w:pPr>
             <w:r/>
             <w:r>
@@ -5263,7 +5309,7 @@
           <w:p>
             <w:pPr>
               <w:spacing w:after="40" w:before="40"/>
-              <w:jc w:val="left"/>
+              <w:jc w:val="center"/>
             </w:pPr>
             <w:r/>
             <w:r>
@@ -5436,6 +5482,7 @@
       </w:tblGrid>
       <w:tr>
         <w:trPr>
+          <w:trHeight w:val="454" w:hRule="atLeast"/>
           <w:cantSplit/>
         </w:trPr>
         <w:tc>

</xml_diff>